<commit_message>
T-0010: fix review round 3 - approve's writes named everywhere, status reads no policy, README phase table
BLOCK: every statement of the approve exception (module and approve
docstrings, commands/autopilot.md, README, CONFIG.md, the daily-workflow
guide and its rebuilt HTML/DOCX/PDF, the code map, CHANGELOG) names what
approve writes - approval.json, scope-tickets.json on a ticket's first
approval, and a distinct successor plan's NEEDS_REPLAN -> IN_REVIEW ledger
move - instead of 'only the approval receipt'.

FIX: status composes next_phase/resume_target with policy=False, so its
approve and open-questions lines read the same under every approval and
questions policy (the open-questions case is the neighbour).

FIX: README's phase table states the policy route at approve.

Tests first; eight POLICY_MUTATIONS, each RED. T-0004's
test_command_never_types_approve now allows the one approval.json the
exception sentence names.
</commit_message>
<xml_diff>
--- a/docs/guides/crew/crew-1.0-daily-workflow.docx
+++ b/docs/guides/crew/crew-1.0-daily-workflow.docx
@@ -2510,17 +2510,37 @@
       </w:r>
       <w:r>
         <w:rPr/>
-        <w:t xml:space="preserve">, which writes an </w:t>
-      </w:r>
-      <w:r>
-        <w:rPr>
-          <w:rStyle w:val="SourceText"/>
-        </w:rPr>
-        <w:t>autopilot</w:t>
-      </w:r>
-      <w:r>
-        <w:rPr/>
-        <w:t xml:space="preserve"> receipt and nothing else. Both default off, so out of the box nothing self-approves. The approval is a step you take, not a lock.</w:t>
+        <w:t xml:space="preserve">. It writes what every approval route writes: </w:t>
+      </w:r>
+      <w:r>
+        <w:rPr>
+          <w:rStyle w:val="SourceText"/>
+        </w:rPr>
+        <w:t>approval.json</w:t>
+      </w:r>
+      <w:r>
+        <w:rPr/>
+        <w:t xml:space="preserve"> (marked </w:t>
+      </w:r>
+      <w:r>
+        <w:rPr>
+          <w:rStyle w:val="SourceText"/>
+        </w:rPr>
+        <w:t>approved_via: "autopilot"</w:t>
+      </w:r>
+      <w:r>
+        <w:rPr/>
+        <w:t xml:space="preserve">), </w:t>
+      </w:r>
+      <w:r>
+        <w:rPr>
+          <w:rStyle w:val="SourceText"/>
+        </w:rPr>
+        <w:t>scope-tickets.json</w:t>
+      </w:r>
+      <w:r>
+        <w:rPr/>
+        <w:t xml:space="preserve"> on a ticket's first approval, and, for a distinct successor plan under a spent review budget, the review ledger moved NEEDS_REPLAN -&gt; IN_REVIEW. Both default off, so out of the box nothing self-approves. The approval is a step you take, not a lock.</w:t>
       </w:r>
     </w:p>
     <w:p>

</xml_diff>

<commit_message>
T-0085: rebuild the daily-workflow and working-with-codex guides (build.py, LibreOffice)
</commit_message>
<xml_diff>
--- a/docs/guides/crew/crew-1.0-daily-workflow.docx
+++ b/docs/guides/crew/crew-1.0-daily-workflow.docx
@@ -333,7 +333,7 @@
       </w:r>
       <w:r>
         <w:rPr/>
-        <w:t xml:space="preserve"> (Files/Test/Risk each), checks every Files: entry against the spec's Touch globs, and enters </w:t>
+        <w:t xml:space="preserve"> (Files/Test/Risk/Standards each), checks every Files: entry against the spec's Touch globs, and enters </w:t>
       </w:r>
       <w:r>
         <w:rPr>
@@ -453,6 +453,74 @@
         <w:rPr>
           <w:rStyle w:val="Strong"/>
         </w:rPr>
+        <w:t>6b. The standards self-check.</w:t>
+      </w:r>
+      <w:r>
+        <w:rPr/>
+        <w:t xml:space="preserve"> Before the review, the session answers every development standard in the effective set (crew's generic GEN standards, any per-language set a changed file matches, and this repository's </w:t>
+      </w:r>
+      <w:r>
+        <w:rPr>
+          <w:rStyle w:val="SourceText"/>
+        </w:rPr>
+        <w:t>.crew/standards.md</w:t>
+      </w:r>
+      <w:r>
+        <w:rPr/>
+        <w:t xml:space="preserve"> overlay) in </w:t>
+      </w:r>
+      <w:r>
+        <w:rPr>
+          <w:rStyle w:val="SourceText"/>
+        </w:rPr>
+        <w:t>.work/tickets/T-0091/selfcheck.md</w:t>
+      </w:r>
+      <w:r>
+        <w:rPr/>
+        <w:t xml:space="preserve">: </w:t>
+      </w:r>
+      <w:r>
+        <w:rPr>
+          <w:rStyle w:val="SourceText"/>
+        </w:rPr>
+        <w:t>addressed</w:t>
+      </w:r>
+      <w:r>
+        <w:rPr/>
+        <w:t xml:space="preserve"> with evidence, or </w:t>
+      </w:r>
+      <w:r>
+        <w:rPr>
+          <w:rStyle w:val="SourceText"/>
+        </w:rPr>
+        <w:t>n/a</w:t>
+      </w:r>
+      <w:r>
+        <w:rPr/>
+        <w:t xml:space="preserve"> with a reason. </w:t>
+      </w:r>
+      <w:r>
+        <w:rPr>
+          <w:rStyle w:val="SourceText"/>
+        </w:rPr>
+        <w:t>crew_standards.py stamp</w:t>
+      </w:r>
+      <w:r>
+        <w:rPr/>
+        <w:t xml:space="preserve"> refuses an incomplete answer sheet and binds a complete one to the exact review bundle, so any later edit needs a new stamp.</w:t>
+      </w:r>
+    </w:p>
+    <w:p>
+      <w:pPr>
+        <w:pStyle w:val="BodyText"/>
+        <w:bidi w:val="0"/>
+        <w:jc w:val="left"/>
+        <w:rPr/>
+      </w:pPr>
+      <w:r>
+        <w:rPr>
+          <w:rStyle w:val="Strong"/>
+        </w:rPr>
         <w:t>7. Review.</w:t>
       </w:r>
       <w:r>
@@ -477,7 +545,7 @@
       </w:r>
       <w:r>
         <w:rPr/>
-        <w:t xml:space="preserve"> last, after tests and docs. Codex reviews the bundle (or Copilot, or the Claude fallback, whichever survives the author-family strike), reports BLOCK/FIX/NIT lines, and you fix the BLOCKs. Two rounds total, ticket-wide — a third is refused and the ticket becomes </w:t>
+        <w:t xml:space="preserve"> last, after tests, docs and the self-check; without a current stamp the review refuses before it spends a round. Codex reviews the bundle (or Copilot, or the Claude fallback, whichever survives the author-family strike), reports BLOCK/FIX/NIT lines, and you fix the BLOCKs. Two rounds total, ticket-wide — a third is refused and the ticket becomes </w:t>
       </w:r>
       <w:r>
         <w:rPr>
@@ -487,7 +555,17 @@
       </w:r>
       <w:r>
         <w:rPr/>
-        <w:t>.</w:t>
+        <w:t xml:space="preserve">. Each round's findings go into a </w:t>
+      </w:r>
+      <w:r>
+        <w:rPr>
+          <w:rStyle w:val="SourceText"/>
+        </w:rPr>
+        <w:t>standards-proposals-r&lt;N&gt;.md</w:t>
+      </w:r>
+      <w:r>
+        <w:rPr/>
+        <w:t xml:space="preserve"> file, one row per finding; you approve or reject each proposed standard, and nothing is added to a standards file on its own.</w:t>
       </w:r>
     </w:p>
     <w:p>
@@ -1572,9 +1650,9 @@
         </w:tblCellMar>
       </w:tblPr>
       <w:tblGrid>
-        <w:gridCol w:w="2912"/>
-        <w:gridCol w:w="4095"/>
-        <w:gridCol w:w="4332"/>
+        <w:gridCol w:w="2608"/>
+        <w:gridCol w:w="3171"/>
+        <w:gridCol w:w="5560"/>
       </w:tblGrid>
       <w:tr>
         <w:trPr>
@@ -1582,7 +1660,7 @@
         </w:trPr>
         <w:tc>
           <w:tcPr>
-            <w:tcW w:w="2912" w:type="dxa"/>
+            <w:tcW w:w="2608" w:type="dxa"/>
             <w:tcBorders/>
             <w:vAlign w:val="center"/>
           </w:tcPr>
@@ -1604,7 +1682,7 @@
         </w:tc>
         <w:tc>
           <w:tcPr>
-            <w:tcW w:w="4095" w:type="dxa"/>
+            <w:tcW w:w="3171" w:type="dxa"/>
             <w:tcBorders/>
             <w:vAlign w:val="center"/>
           </w:tcPr>
@@ -1626,7 +1704,7 @@
         </w:tc>
         <w:tc>
           <w:tcPr>
-            <w:tcW w:w="4332" w:type="dxa"/>
+            <w:tcW w:w="5560" w:type="dxa"/>
             <w:tcBorders/>
             <w:vAlign w:val="center"/>
           </w:tcPr>
@@ -1651,7 +1729,7 @@
         <w:trPr/>
         <w:tc>
           <w:tcPr>
-            <w:tcW w:w="2912" w:type="dxa"/>
+            <w:tcW w:w="2608" w:type="dxa"/>
             <w:tcBorders/>
             <w:vAlign w:val="center"/>
           </w:tcPr>
@@ -1678,7 +1756,7 @@
         </w:tc>
         <w:tc>
           <w:tcPr>
-            <w:tcW w:w="4095" w:type="dxa"/>
+            <w:tcW w:w="3171" w:type="dxa"/>
             <w:tcBorders/>
             <w:vAlign w:val="center"/>
           </w:tcPr>
@@ -1709,7 +1787,7 @@
         </w:tc>
         <w:tc>
           <w:tcPr>
-            <w:tcW w:w="4332" w:type="dxa"/>
+            <w:tcW w:w="5560" w:type="dxa"/>
             <w:tcBorders/>
             <w:vAlign w:val="center"/>
           </w:tcPr>
@@ -1745,7 +1823,7 @@
         <w:trPr/>
         <w:tc>
           <w:tcPr>
-            <w:tcW w:w="2912" w:type="dxa"/>
+            <w:tcW w:w="2608" w:type="dxa"/>
             <w:tcBorders/>
             <w:vAlign w:val="center"/>
           </w:tcPr>
@@ -1766,7 +1844,7 @@
         </w:tc>
         <w:tc>
           <w:tcPr>
-            <w:tcW w:w="4095" w:type="dxa"/>
+            <w:tcW w:w="3171" w:type="dxa"/>
             <w:tcBorders/>
             <w:vAlign w:val="center"/>
           </w:tcPr>
@@ -1787,7 +1865,7 @@
         </w:tc>
         <w:tc>
           <w:tcPr>
-            <w:tcW w:w="4332" w:type="dxa"/>
+            <w:tcW w:w="5560" w:type="dxa"/>
             <w:tcBorders/>
             <w:vAlign w:val="center"/>
           </w:tcPr>
@@ -1821,7 +1899,7 @@
         <w:trPr/>
         <w:tc>
           <w:tcPr>
-            <w:tcW w:w="2912" w:type="dxa"/>
+            <w:tcW w:w="2608" w:type="dxa"/>
             <w:tcBorders/>
             <w:vAlign w:val="center"/>
           </w:tcPr>
@@ -1838,23 +1916,23 @@
               <w:rPr>
                 <w:rStyle w:val="SourceText"/>
               </w:rPr>
-              <w:t>/crew:done</w:t>
-            </w:r>
-            <w:r>
-              <w:rPr/>
-              <w:t xml:space="preserve"> reports </w:t>
+              <w:t>/crew:review</w:t>
+            </w:r>
+            <w:r>
+              <w:rPr/>
+              <w:t xml:space="preserve"> exits 2 with </w:t>
             </w:r>
             <w:r>
               <w:rPr>
                 <w:rStyle w:val="SourceText"/>
               </w:rPr>
-              <w:t>NEEDS_REPLAN</w:t>
+              <w:t>review-run: self-check: ...</w:t>
             </w:r>
           </w:p>
         </w:tc>
         <w:tc>
           <w:tcPr>
-            <w:tcW w:w="4095" w:type="dxa"/>
+            <w:tcW w:w="3171" w:type="dxa"/>
             <w:tcBorders/>
             <w:vAlign w:val="center"/>
           </w:tcPr>
@@ -1869,13 +1947,13 @@
             </w:pPr>
             <w:r>
               <w:rPr/>
-              <w:t>the review budget (two rounds) is spent</w:t>
+              <w:t>the standards self-check is missing, incomplete, or stamped for an earlier state of the change</w:t>
             </w:r>
           </w:p>
         </w:tc>
         <w:tc>
           <w:tcPr>
-            <w:tcW w:w="4332" w:type="dxa"/>
+            <w:tcW w:w="5560" w:type="dxa"/>
             <w:tcBorders/>
             <w:vAlign w:val="center"/>
           </w:tcPr>
@@ -1889,14 +1967,28 @@
               <w:rPr/>
             </w:pPr>
             <w:r>
+              <w:rPr/>
+              <w:t xml:space="preserve">answer </w:t>
+            </w:r>
+            <w:r>
               <w:rPr>
                 <w:rStyle w:val="SourceText"/>
               </w:rPr>
-              <w:t>/crew:plan &lt;id&gt;</w:t>
-            </w:r>
-            <w:r>
-              <w:rPr/>
-              <w:t xml:space="preserve"> for a successor plan; no third round</w:t>
+              <w:t>.work/tickets/&lt;id&gt;/selfcheck.md</w:t>
+            </w:r>
+            <w:r>
+              <w:rPr/>
+              <w:t xml:space="preserve">, run </w:t>
+            </w:r>
+            <w:r>
+              <w:rPr>
+                <w:rStyle w:val="SourceText"/>
+              </w:rPr>
+              <w:t>crew_standards.py stamp --root . --ticket &lt;id&gt;</w:t>
+            </w:r>
+            <w:r>
+              <w:rPr/>
+              <w:t>, rebuild the bundle and run the round again; no round was spent</w:t>
             </w:r>
           </w:p>
         </w:tc>
@@ -1905,7 +1997,7 @@
         <w:trPr/>
         <w:tc>
           <w:tcPr>
-            <w:tcW w:w="2912" w:type="dxa"/>
+            <w:tcW w:w="2608" w:type="dxa"/>
             <w:tcBorders/>
             <w:vAlign w:val="center"/>
           </w:tcPr>
@@ -1926,13 +2018,19 @@
             </w:r>
             <w:r>
               <w:rPr/>
-              <w:t xml:space="preserve"> fails the completion audit</w:t>
+              <w:t xml:space="preserve"> reports </w:t>
+            </w:r>
+            <w:r>
+              <w:rPr>
+                <w:rStyle w:val="SourceText"/>
+              </w:rPr>
+              <w:t>NEEDS_REPLAN</w:t>
             </w:r>
           </w:p>
         </w:tc>
         <w:tc>
           <w:tcPr>
-            <w:tcW w:w="4095" w:type="dxa"/>
+            <w:tcW w:w="3171" w:type="dxa"/>
             <w:tcBorders/>
             <w:vAlign w:val="center"/>
           </w:tcPr>
@@ -1947,13 +2045,91 @@
             </w:pPr>
             <w:r>
               <w:rPr/>
-              <w:t>a path outside scope changed, including one a shell command wrote</w:t>
+              <w:t>the review budget (two rounds) is spent</w:t>
             </w:r>
           </w:p>
         </w:tc>
         <w:tc>
           <w:tcPr>
-            <w:tcW w:w="4332" w:type="dxa"/>
+            <w:tcW w:w="5560" w:type="dxa"/>
+            <w:tcBorders/>
+            <w:vAlign w:val="center"/>
+          </w:tcPr>
+          <w:p>
+            <w:pPr>
+              <w:pStyle w:val="TableContents"/>
+              <w:shd w:fill="2E3440" w:val="clear"/>
+              <w:bidi w:val="0"/>
+              <w:spacing w:before="120" w:after="120"/>
+              <w:jc w:val="left"/>
+              <w:rPr/>
+            </w:pPr>
+            <w:r>
+              <w:rPr>
+                <w:rStyle w:val="SourceText"/>
+              </w:rPr>
+              <w:t>/crew:plan &lt;id&gt;</w:t>
+            </w:r>
+            <w:r>
+              <w:rPr/>
+              <w:t xml:space="preserve"> for a successor plan; no third round</w:t>
+            </w:r>
+          </w:p>
+        </w:tc>
+      </w:tr>
+      <w:tr>
+        <w:trPr/>
+        <w:tc>
+          <w:tcPr>
+            <w:tcW w:w="2608" w:type="dxa"/>
+            <w:tcBorders/>
+            <w:vAlign w:val="center"/>
+          </w:tcPr>
+          <w:p>
+            <w:pPr>
+              <w:pStyle w:val="TableContents"/>
+              <w:shd w:fill="2E3440" w:val="clear"/>
+              <w:bidi w:val="0"/>
+              <w:spacing w:before="120" w:after="120"/>
+              <w:jc w:val="left"/>
+              <w:rPr/>
+            </w:pPr>
+            <w:r>
+              <w:rPr>
+                <w:rStyle w:val="SourceText"/>
+              </w:rPr>
+              <w:t>/crew:done</w:t>
+            </w:r>
+            <w:r>
+              <w:rPr/>
+              <w:t xml:space="preserve"> fails the completion audit</w:t>
+            </w:r>
+          </w:p>
+        </w:tc>
+        <w:tc>
+          <w:tcPr>
+            <w:tcW w:w="3171" w:type="dxa"/>
+            <w:tcBorders/>
+            <w:vAlign w:val="center"/>
+          </w:tcPr>
+          <w:p>
+            <w:pPr>
+              <w:pStyle w:val="TableContents"/>
+              <w:shd w:fill="2E3440" w:val="clear"/>
+              <w:bidi w:val="0"/>
+              <w:spacing w:before="120" w:after="120"/>
+              <w:jc w:val="left"/>
+              <w:rPr/>
+            </w:pPr>
+            <w:r>
+              <w:rPr/>
+              <w:t>a path outside scope changed, including one a shell command wrote</w:t>
+            </w:r>
+          </w:p>
+        </w:tc>
+        <w:tc>
+          <w:tcPr>
+            <w:tcW w:w="5560" w:type="dxa"/>
             <w:tcBorders/>
             <w:vAlign w:val="center"/>
           </w:tcPr>

</xml_diff>

<commit_message>
T-0100 docs: daily-workflow and troubleshooting guides rebuilt (HTML, DOCX, PDF; renderer LibreOffice 26.2.5.2, not Word)
</commit_message>
<xml_diff>
--- a/docs/guides/crew/crew-1.0-daily-workflow.docx
+++ b/docs/guides/crew/crew-1.0-daily-workflow.docx
@@ -515,7 +515,7 @@
       </w:r>
       <w:r>
         <w:rPr/>
-        <w:t>. Three checks, all required: the review receipt rebuilds clean, the verify gate is clean, and the completion audit (the whole tree diffed against the scope base) finds nothing outside scope. Any one failing refuses the close and names what to fix. On success it appends a metrics row, marks the ticket done, and clears a stale handoff.</w:t>
+        <w:t>. Three checks, all required: the review receipt rebuilds clean, the verify gate is clean, and the completion audit (the whole tree diffed against the scope base, not counting a file that is byte-identical to main as last merged) finds nothing outside scope. Any one failing refuses the close and names what to fix. On success it appends a metrics row, marks the ticket done, and clears a stale handoff.</w:t>
       </w:r>
     </w:p>
     <w:p>
@@ -2848,7 +2848,7 @@
       </w:r>
       <w:r>
         <w:rPr/>
-        <w:t xml:space="preserve">, a shell redirect or a formatter can still change files. So when the session stops, the completion audit compares the whole tree with the commit the ticket started from. It covers committed, staged, unstaged and untracked changes, and both ends of a rename. If any changed path is outside Touch, the audit blocks the stop and lists the paths in six lines or fewer. It never blocks the continuation it caused. </w:t>
+        <w:t xml:space="preserve">, a shell redirect or a formatter can still change files. So when the session stops, the completion audit compares the whole tree with the commit the ticket started from. It covers committed, staged, unstaged and untracked changes, and both ends of a rename. After you merge main, a file byte-identical to the merged main commit is not counted: it is main's change, not the ticket's; the verdict names that commit. If any changed path is outside Touch, the audit blocks the stop and lists the paths in six lines or fewer. It never blocks the continuation it caused. </w:t>
       </w:r>
       <w:r>
         <w:rPr>

</xml_diff>

<commit_message>
T-0094 step 5: rebuild the daily-workflow guide (HTML, DOCX, PDF; LibreOffice 26.2.5.2, not Word)
</commit_message>
<xml_diff>
--- a/docs/guides/crew/crew-1.0-daily-workflow.docx
+++ b/docs/guides/crew/crew-1.0-daily-workflow.docx
@@ -2664,37 +2664,27 @@
       </w:pPr>
       <w:r>
         <w:rPr/>
-        <w:t xml:space="preserve">Nothing else is exempt, including </w:t>
-      </w:r>
-      <w:r>
-        <w:rPr>
-          <w:rStyle w:val="SourceText"/>
-        </w:rPr>
-        <w:t>.crew/</w:t>
-      </w:r>
-      <w:r>
-        <w:rPr/>
-        <w:t xml:space="preserve">, </w:t>
-      </w:r>
-      <w:r>
-        <w:rPr>
-          <w:rStyle w:val="SourceText"/>
-        </w:rPr>
-        <w:t>TODO.md</w:t>
-      </w:r>
-      <w:r>
-        <w:rPr/>
-        <w:t xml:space="preserve">, </w:t>
-      </w:r>
-      <w:r>
-        <w:rPr>
-          <w:rStyle w:val="SourceText"/>
-        </w:rPr>
-        <w:t>.claude/</w:t>
-      </w:r>
-      <w:r>
-        <w:rPr/>
-        <w:t xml:space="preserve"> and crew's own policy files. If the ticket changes one of them, list it in Touch. </w:t>
+        <w:t xml:space="preserve">The code map, the diagrams dir, the graph dir and </w:t>
+      </w:r>
+      <w:r>
+        <w:rPr>
+          <w:rStyle w:val="SourceText"/>
+        </w:rPr>
+        <w:t>.claude/rules/</w:t>
+      </w:r>
+      <w:r>
+        <w:rPr/>
+        <w:t xml:space="preserve"> are writable for an approved ticket, because </w:t>
+      </w:r>
+      <w:r>
+        <w:rPr>
+          <w:rStyle w:val="SourceText"/>
+        </w:rPr>
+        <w:t>/crew:implement</w:t>
+      </w:r>
+      <w:r>
+        <w:rPr/>
+        <w:t xml:space="preserve"> step 6 refreshes them. </w:t>
       </w:r>
     </w:p>
     <w:p>
@@ -2709,6 +2699,58 @@
           <w:tab w:val="left" w:pos="829" w:leader="none"/>
         </w:tabs>
         <w:bidi w:val="0"/>
+        <w:spacing w:before="120" w:after="0"/>
+        <w:ind w:hanging="283" w:left="829"/>
+        <w:jc w:val="left"/>
+        <w:rPr/>
+      </w:pPr>
+      <w:r>
+        <w:rPr/>
+        <w:t xml:space="preserve">Nothing else is exempt: </w:t>
+      </w:r>
+      <w:r>
+        <w:rPr>
+          <w:rStyle w:val="SourceText"/>
+        </w:rPr>
+        <w:t>.crew/</w:t>
+      </w:r>
+      <w:r>
+        <w:rPr/>
+        <w:t xml:space="preserve"> beyond the code map, </w:t>
+      </w:r>
+      <w:r>
+        <w:rPr>
+          <w:rStyle w:val="SourceText"/>
+        </w:rPr>
+        <w:t>TODO.md</w:t>
+      </w:r>
+      <w:r>
+        <w:rPr/>
+        <w:t xml:space="preserve">, the rest of </w:t>
+      </w:r>
+      <w:r>
+        <w:rPr>
+          <w:rStyle w:val="SourceText"/>
+        </w:rPr>
+        <w:t>.claude/</w:t>
+      </w:r>
+      <w:r>
+        <w:rPr/>
+        <w:t xml:space="preserve"> and crew's own policy files. If the ticket changes one of them, list it in Touch. </w:t>
+      </w:r>
+    </w:p>
+    <w:p>
+      <w:pPr>
+        <w:pStyle w:val="BodyText"/>
+        <w:numPr>
+          <w:ilvl w:val="0"/>
+          <w:numId w:val="6"/>
+        </w:numPr>
+        <w:tabs>
+          <w:tab w:val="clear" w:pos="1134"/>
+          <w:tab w:val="left" w:pos="829" w:leader="none"/>
+        </w:tabs>
+        <w:bidi w:val="0"/>
         <w:ind w:hanging="283" w:left="829"/>
         <w:jc w:val="left"/>
         <w:rPr/>
@@ -2848,7 +2890,69 @@
       </w:r>
       <w:r>
         <w:rPr/>
-        <w:t xml:space="preserve">, a shell redirect or a formatter can still change files. So when the session stops, the completion audit compares the whole tree with the commit the ticket started from. It covers committed, staged, unstaged and untracked changes, and both ends of a rename. If any changed path is outside Touch, the audit blocks the stop and lists the paths in six lines or fewer. It never blocks the continuation it caused. </w:t>
+        <w:t>, a shell redirect or a formatter can still change files. So when the session stops, the completion audit compares the whole tree with the commit the ticket started from. It covers committed, staged, unstaged and untracked changes, and both ends of a rename. If any changed path is outside Touch, the audit blocks the stop and lists the paths in six lines or fewer. It never blocks the continuation it caused.</w:t>
+      </w:r>
+    </w:p>
+    <w:p>
+      <w:pPr>
+        <w:pStyle w:val="BodyText"/>
+        <w:bidi w:val="0"/>
+        <w:jc w:val="left"/>
+        <w:rPr/>
+      </w:pPr>
+      <w:r>
+        <w:rPr/>
+        <w:t xml:space="preserve">A changed refresh artifact passes the audit only when a path the ticket changed reaches it and the edit is a re-anchor (the </w:t>
+      </w:r>
+      <w:r>
+        <w:rPr>
+          <w:rStyle w:val="SourceText"/>
+        </w:rPr>
+        <w:t>anchor:</w:t>
+      </w:r>
+      <w:r>
+        <w:rPr/>
+        <w:t xml:space="preserve"> or provenance sha moved to a commit on this branch) or a regeneration (</w:t>
+      </w:r>
+      <w:r>
+        <w:rPr>
+          <w:rStyle w:val="SourceText"/>
+        </w:rPr>
+        <w:t>.claude/rules/</w:t>
+      </w:r>
+      <w:r>
+        <w:rPr/>
+        <w:t xml:space="preserve"> as </w:t>
+      </w:r>
+      <w:r>
+        <w:rPr>
+          <w:rStyle w:val="SourceText"/>
+        </w:rPr>
+        <w:t>crew_instructions.py rules</w:t>
+      </w:r>
+      <w:r>
+        <w:rPr/>
+        <w:t xml:space="preserve"> writes them, the graph after a code change). A map claim edited without a re-anchor is listed with </w:t>
+      </w:r>
+      <w:r>
+        <w:rPr>
+          <w:rStyle w:val="SourceText"/>
+        </w:rPr>
+        <w:t>[anchor did not move]</w:t>
+      </w:r>
+      <w:r>
+        <w:rPr/>
+        <w:t xml:space="preserve">, and belongs in Touch if that is what the ticket means to do. When git cannot answer, the listing says </w:t>
+      </w:r>
+      <w:r>
+        <w:rPr>
+          <w:rStyle w:val="SourceText"/>
+        </w:rPr>
+        <w:t>[could not tell: ...]</w:t>
+      </w:r>
+      <w:r>
+        <w:rPr/>
+        <w:t xml:space="preserve">, and that never passes. </w:t>
       </w:r>
       <w:r>
         <w:rPr>

</xml_diff>

<commit_message>
crew 1.0.60: webtest scaffold for multi-module repos (T-0104)
</commit_message>
<xml_diff>
--- a/docs/guides/crew/crew-1.0-daily-workflow.docx
+++ b/docs/guides/crew/crew-1.0-daily-workflow.docx
@@ -1257,7 +1257,17 @@
       </w:r>
       <w:r>
         <w:rPr/>
-        <w:t xml:space="preserve"> sits inside the normal eight phases rather than replacing them:</w:t>
+        <w:t xml:space="preserve"> sits inside the normal eight phases rather than replacing them. When the Playwright config lives in a module below the repository root, pass </w:t>
+      </w:r>
+      <w:r>
+        <w:rPr>
+          <w:rStyle w:val="SourceText"/>
+        </w:rPr>
+        <w:t>--module &lt;dir&gt;</w:t>
+      </w:r>
+      <w:r>
+        <w:rPr/>
+        <w:t>: the agents stay at the root, the seed test and specs come from the module, and the guards read that module's config:</w:t>
       </w:r>
     </w:p>
     <w:p>

</xml_diff>

<commit_message>
T-0100 docs after the merge of main 8ab733d7: troubleshooting and daily-workflow guides rebuilt from the merged sources (DOCX, PDF; HTML unchanged; LibreOffice 26.2.5.2, not Word)
</commit_message>
<xml_diff>
--- a/docs/guides/crew/crew-1.0-daily-workflow.docx
+++ b/docs/guides/crew/crew-1.0-daily-workflow.docx
@@ -515,7 +515,7 @@
       </w:r>
       <w:r>
         <w:rPr/>
-        <w:t>. Three checks, all required: the review receipt rebuilds clean, the verify gate is clean, and the completion audit (the whole tree diffed against the scope base) finds nothing outside scope. Any one failing refuses the close and names what to fix. On success it appends a metrics row, marks the ticket done, and clears a stale handoff.</w:t>
+        <w:t>. Three checks, all required: the review receipt rebuilds clean, the verify gate is clean, and the completion audit (the whole tree diffed against the scope base, not counting a file that is byte-identical to main as last merged) finds nothing outside scope. Any one failing refuses the close and names what to fix. On success it appends a metrics row, marks the ticket done, and clears a stale handoff.</w:t>
       </w:r>
     </w:p>
     <w:p>
@@ -2948,7 +2948,7 @@
       </w:r>
       <w:r>
         <w:rPr/>
-        <w:t xml:space="preserve">, a shell redirect or a formatter can still change files. So when the session stops, the completion audit compares the whole tree with the commit the ticket started from. It covers committed, staged, unstaged and untracked changes, and both ends of a rename. If any changed path is outside Touch, the audit blocks the stop and lists the paths in six lines or fewer. It never blocks the continuation it caused. </w:t>
+        <w:t xml:space="preserve">, a shell redirect or a formatter can still change files. So when the session stops, the completion audit compares the whole tree with the commit the ticket started from. It covers committed, staged, unstaged and untracked changes, and both ends of a rename. After you merge main, a file byte-identical to the merged main commit is not counted: it is main's change, not the ticket's; the verdict names that commit. If any changed path is outside Touch, the audit blocks the stop and lists the paths in six lines or fewer. It never blocks the continuation it caused. </w:t>
       </w:r>
       <w:r>
         <w:rPr>

</xml_diff>

<commit_message>
T-0104: rebuild the daily-workflow guide after merging 8ab733d7
</commit_message>
<xml_diff>
--- a/docs/guides/crew/crew-1.0-daily-workflow.docx
+++ b/docs/guides/crew/crew-1.0-daily-workflow.docx
@@ -1257,7 +1257,17 @@
       </w:r>
       <w:r>
         <w:rPr/>
-        <w:t xml:space="preserve"> sits inside the normal eight phases rather than replacing them:</w:t>
+        <w:t xml:space="preserve"> sits inside the normal eight phases rather than replacing them. When the Playwright config lives in a module below the repository root, pass </w:t>
+      </w:r>
+      <w:r>
+        <w:rPr>
+          <w:rStyle w:val="SourceText"/>
+        </w:rPr>
+        <w:t>--module &lt;dir&gt;</w:t>
+      </w:r>
+      <w:r>
+        <w:rPr/>
+        <w:t>: the agents stay at the root, the seed test and specs come from the module, and the guards read that module's config:</w:t>
       </w:r>
     </w:p>
     <w:p>

</xml_diff>

<commit_message>
T-0094: rebuild the daily-workflow guide (HTML, DOCX, PDF; LibreOffice 26.2.5.2, not Word) from the merged source and the round-2 could-not-tell wording
</commit_message>
<xml_diff>
--- a/docs/guides/crew/crew-1.0-daily-workflow.docx
+++ b/docs/guides/crew/crew-1.0-daily-workflow.docx
@@ -2764,37 +2764,27 @@
       </w:pPr>
       <w:r>
         <w:rPr/>
-        <w:t xml:space="preserve">Nothing else is exempt, including </w:t>
-      </w:r>
-      <w:r>
-        <w:rPr>
-          <w:rStyle w:val="SourceText"/>
-        </w:rPr>
-        <w:t>.crew/</w:t>
-      </w:r>
-      <w:r>
-        <w:rPr/>
-        <w:t xml:space="preserve">, </w:t>
-      </w:r>
-      <w:r>
-        <w:rPr>
-          <w:rStyle w:val="SourceText"/>
-        </w:rPr>
-        <w:t>TODO.md</w:t>
-      </w:r>
-      <w:r>
-        <w:rPr/>
-        <w:t xml:space="preserve">, </w:t>
-      </w:r>
-      <w:r>
-        <w:rPr>
-          <w:rStyle w:val="SourceText"/>
-        </w:rPr>
-        <w:t>.claude/</w:t>
-      </w:r>
-      <w:r>
-        <w:rPr/>
-        <w:t xml:space="preserve"> and crew's own policy files. If the ticket changes one of them, list it in Touch. </w:t>
+        <w:t xml:space="preserve">The code map, the diagrams dir, the graph dir and </w:t>
+      </w:r>
+      <w:r>
+        <w:rPr>
+          <w:rStyle w:val="SourceText"/>
+        </w:rPr>
+        <w:t>.claude/rules/</w:t>
+      </w:r>
+      <w:r>
+        <w:rPr/>
+        <w:t xml:space="preserve"> are writable for an approved ticket, because </w:t>
+      </w:r>
+      <w:r>
+        <w:rPr>
+          <w:rStyle w:val="SourceText"/>
+        </w:rPr>
+        <w:t>/crew:implement</w:t>
+      </w:r>
+      <w:r>
+        <w:rPr/>
+        <w:t xml:space="preserve"> step 6 refreshes them. </w:t>
       </w:r>
     </w:p>
     <w:p>
@@ -2809,6 +2799,58 @@
           <w:tab w:val="left" w:pos="829" w:leader="none"/>
         </w:tabs>
         <w:bidi w:val="0"/>
+        <w:spacing w:before="120" w:after="0"/>
+        <w:ind w:hanging="283" w:left="829"/>
+        <w:jc w:val="left"/>
+        <w:rPr/>
+      </w:pPr>
+      <w:r>
+        <w:rPr/>
+        <w:t xml:space="preserve">Nothing else is exempt: </w:t>
+      </w:r>
+      <w:r>
+        <w:rPr>
+          <w:rStyle w:val="SourceText"/>
+        </w:rPr>
+        <w:t>.crew/</w:t>
+      </w:r>
+      <w:r>
+        <w:rPr/>
+        <w:t xml:space="preserve"> beyond the code map, </w:t>
+      </w:r>
+      <w:r>
+        <w:rPr>
+          <w:rStyle w:val="SourceText"/>
+        </w:rPr>
+        <w:t>TODO.md</w:t>
+      </w:r>
+      <w:r>
+        <w:rPr/>
+        <w:t xml:space="preserve">, the rest of </w:t>
+      </w:r>
+      <w:r>
+        <w:rPr>
+          <w:rStyle w:val="SourceText"/>
+        </w:rPr>
+        <w:t>.claude/</w:t>
+      </w:r>
+      <w:r>
+        <w:rPr/>
+        <w:t xml:space="preserve"> and crew's own policy files. If the ticket changes one of them, list it in Touch. </w:t>
+      </w:r>
+    </w:p>
+    <w:p>
+      <w:pPr>
+        <w:pStyle w:val="BodyText"/>
+        <w:numPr>
+          <w:ilvl w:val="0"/>
+          <w:numId w:val="6"/>
+        </w:numPr>
+        <w:tabs>
+          <w:tab w:val="clear" w:pos="1134"/>
+          <w:tab w:val="left" w:pos="829" w:leader="none"/>
+        </w:tabs>
+        <w:bidi w:val="0"/>
         <w:ind w:hanging="283" w:left="829"/>
         <w:jc w:val="left"/>
         <w:rPr/>
@@ -2948,7 +2990,69 @@
       </w:r>
       <w:r>
         <w:rPr/>
-        <w:t xml:space="preserve">, a shell redirect or a formatter can still change files. So when the session stops, the completion audit compares the whole tree with the commit the ticket started from. It covers committed, staged, unstaged and untracked changes, and both ends of a rename. If any changed path is outside Touch, the audit blocks the stop and lists the paths in six lines or fewer. It never blocks the continuation it caused. </w:t>
+        <w:t>, a shell redirect or a formatter can still change files. So when the session stops, the completion audit compares the whole tree with the commit the ticket started from. It covers committed, staged, unstaged and untracked changes, and both ends of a rename. If any changed path is outside Touch, the audit blocks the stop and lists the paths in six lines or fewer. It never blocks the continuation it caused.</w:t>
+      </w:r>
+    </w:p>
+    <w:p>
+      <w:pPr>
+        <w:pStyle w:val="BodyText"/>
+        <w:bidi w:val="0"/>
+        <w:jc w:val="left"/>
+        <w:rPr/>
+      </w:pPr>
+      <w:r>
+        <w:rPr/>
+        <w:t xml:space="preserve">A changed refresh artifact passes the audit only when a path the ticket changed reaches it and the edit is a re-anchor (the </w:t>
+      </w:r>
+      <w:r>
+        <w:rPr>
+          <w:rStyle w:val="SourceText"/>
+        </w:rPr>
+        <w:t>anchor:</w:t>
+      </w:r>
+      <w:r>
+        <w:rPr/>
+        <w:t xml:space="preserve"> or provenance sha moved forward to a commit on this branch) or a regeneration (</w:t>
+      </w:r>
+      <w:r>
+        <w:rPr>
+          <w:rStyle w:val="SourceText"/>
+        </w:rPr>
+        <w:t>.claude/rules/</w:t>
+      </w:r>
+      <w:r>
+        <w:rPr/>
+        <w:t xml:space="preserve"> as </w:t>
+      </w:r>
+      <w:r>
+        <w:rPr>
+          <w:rStyle w:val="SourceText"/>
+        </w:rPr>
+        <w:t>crew_instructions.py rules</w:t>
+      </w:r>
+      <w:r>
+        <w:rPr/>
+        <w:t xml:space="preserve"> writes them, the graph after a code change). A map claim edited without a re-anchor is listed with </w:t>
+      </w:r>
+      <w:r>
+        <w:rPr>
+          <w:rStyle w:val="SourceText"/>
+        </w:rPr>
+        <w:t>[anchor did not move]</w:t>
+      </w:r>
+      <w:r>
+        <w:rPr/>
+        <w:t xml:space="preserve">, and belongs in Touch if that is what the ticket means to do. When git cannot answer, or a rule file cannot be read, the listing says </w:t>
+      </w:r>
+      <w:r>
+        <w:rPr>
+          <w:rStyle w:val="SourceText"/>
+        </w:rPr>
+        <w:t>[could not tell: ...]</w:t>
+      </w:r>
+      <w:r>
+        <w:rPr/>
+        <w:t xml:space="preserve">, and that never passes. </w:t>
       </w:r>
       <w:r>
         <w:rPr>

</xml_diff>

<commit_message>
T-0504: rebuild the daily-workflow and troubleshooting guides (build.py, LibreOffice 26.2.5.2 on Linux)
</commit_message>
<xml_diff>
--- a/docs/guides/crew/crew-1.0-daily-workflow.docx
+++ b/docs/guides/crew/crew-1.0-daily-workflow.docx
@@ -3585,19 +3585,141 @@
       <w:pPr>
         <w:pStyle w:val="BodyText"/>
         <w:bidi w:val="0"/>
+        <w:jc w:val="left"/>
+        <w:rPr/>
+      </w:pPr>
+      <w:r>
+        <w:rPr>
+          <w:rStyle w:val="SourceText"/>
+        </w:rPr>
+        <w:t>crew_ticket.py activate --ticket &lt;id&gt;</w:t>
+      </w:r>
+      <w:r>
+        <w:rPr/>
+        <w:t xml:space="preserve"> sets the active ticket for the current worktree. </w:t>
+      </w:r>
+      <w:r>
+        <w:rPr>
+          <w:rStyle w:val="SourceText"/>
+        </w:rPr>
+        <w:t>deactivate</w:t>
+      </w:r>
+      <w:r>
+        <w:rPr/>
+        <w:t xml:space="preserve"> clears it, and </w:t>
+      </w:r>
+      <w:r>
+        <w:rPr>
+          <w:rStyle w:val="SourceText"/>
+        </w:rPr>
+        <w:t>active</w:t>
+      </w:r>
+      <w:r>
+        <w:rPr/>
+        <w:t xml:space="preserve"> prints it. Without a setting, crew uses the open ticket in </w:t>
+      </w:r>
+      <w:r>
+        <w:rPr>
+          <w:rStyle w:val="SourceText"/>
+        </w:rPr>
+        <w:t>.work/INDEX.md</w:t>
+      </w:r>
+      <w:r>
+        <w:rPr/>
+        <w:t xml:space="preserve"> if </w:t>
+      </w:r>
+      <w:r>
+        <w:rPr>
+          <w:rStyle w:val="SourceText"/>
+        </w:rPr>
+        <w:t>.work/tickets/&lt;id&gt;/</w:t>
+      </w:r>
+      <w:r>
+        <w:rPr/>
+        <w:t xml:space="preserve"> exists. With no active ticket, the edit guard only protects approval and ledger state, and the completion audit does nothing.</w:t>
+      </w:r>
+    </w:p>
+    <w:p>
+      <w:pPr>
+        <w:pStyle w:val="BodyText"/>
+        <w:bidi w:val="0"/>
         <w:spacing w:before="120" w:after="120"/>
         <w:jc w:val="left"/>
         <w:rPr/>
       </w:pPr>
       <w:r>
-        <w:rPr>
-          <w:rStyle w:val="SourceText"/>
-        </w:rPr>
-        <w:t>crew_ticket.py activate --ticket &lt;id&gt;</w:t>
-      </w:r>
-      <w:r>
-        <w:rPr/>
-        <w:t xml:space="preserve"> sets the active ticket for the current worktree. </w:t>
+        <w:rPr/>
+        <w:t xml:space="preserve">Who moves it depends on whether the move can widen scope. </w:t>
+      </w:r>
+      <w:r>
+        <w:rPr>
+          <w:rStyle w:val="SourceText"/>
+        </w:rPr>
+        <w:t>/crew:autopilot</w:t>
+      </w:r>
+      <w:r>
+        <w:rPr/>
+        <w:t xml:space="preserve"> sets it itself when the worktree has no active ticket, when it already names the ticket, or when it names a ticket closed by an accepted review (a </w:t>
+      </w:r>
+      <w:r>
+        <w:rPr>
+          <w:rStyle w:val="SourceText"/>
+        </w:rPr>
+        <w:t>clean</w:t>
+      </w:r>
+      <w:r>
+        <w:rPr/>
+        <w:t xml:space="preserve"> or </w:t>
+      </w:r>
+      <w:r>
+        <w:rPr>
+          <w:rStyle w:val="SourceText"/>
+        </w:rPr>
+        <w:t>owner-accepted</w:t>
+      </w:r>
+      <w:r>
+        <w:rPr/>
+        <w:t xml:space="preserve"> receipt in the review ledger, plus </w:t>
+      </w:r>
+      <w:r>
+        <w:rPr>
+          <w:rStyle w:val="SourceText"/>
+        </w:rPr>
+        <w:t>done</w:t>
+      </w:r>
+      <w:r>
+        <w:rPr/>
+        <w:t xml:space="preserve"> in </w:t>
+      </w:r>
+      <w:r>
+        <w:rPr>
+          <w:rStyle w:val="SourceText"/>
+        </w:rPr>
+        <w:t>.work/INDEX.md</w:t>
+      </w:r>
+      <w:r>
+        <w:rPr/>
+        <w:t xml:space="preserve"> or the spec header). Moving off a ticket that is still in flight is yours: type </w:t>
+      </w:r>
+      <w:r>
+        <w:rPr>
+          <w:rStyle w:val="SourceText"/>
+        </w:rPr>
+        <w:t>/crew:autopilot &lt;id&gt;</w:t>
+      </w:r>
+      <w:r>
+        <w:rPr/>
+        <w:t xml:space="preserve">, and crew's prompt hook re-points this worktree and says which ticket it left. The edit guard refuses the session's own </w:t>
+      </w:r>
+      <w:r>
+        <w:rPr>
+          <w:rStyle w:val="SourceText"/>
+        </w:rPr>
+        <w:t>activate</w:t>
+      </w:r>
+      <w:r>
+        <w:rPr/>
+        <w:t xml:space="preserve"> or </w:t>
       </w:r>
       <w:r>
         <w:rPr>
@@ -3607,37 +3729,17 @@
       </w:r>
       <w:r>
         <w:rPr/>
-        <w:t xml:space="preserve"> clears it, and </w:t>
-      </w:r>
-      <w:r>
-        <w:rPr>
-          <w:rStyle w:val="SourceText"/>
-        </w:rPr>
-        <w:t>active</w:t>
-      </w:r>
-      <w:r>
-        <w:rPr/>
-        <w:t xml:space="preserve"> prints it. Without a setting, crew uses the open ticket in </w:t>
-      </w:r>
-      <w:r>
-        <w:rPr>
-          <w:rStyle w:val="SourceText"/>
-        </w:rPr>
-        <w:t>.work/INDEX.md</w:t>
-      </w:r>
-      <w:r>
-        <w:rPr/>
-        <w:t xml:space="preserve"> if </w:t>
-      </w:r>
-      <w:r>
-        <w:rPr>
-          <w:rStyle w:val="SourceText"/>
-        </w:rPr>
-        <w:t>.work/tickets/&lt;id&gt;/</w:t>
-      </w:r>
-      <w:r>
-        <w:rPr/>
-        <w:t xml:space="preserve"> exists. With no active ticket, the edit guard only protects approval and ledger state, and the completion audit does nothing.</w:t>
+        <w:t xml:space="preserve"> for that move under every mode but </w:t>
+      </w:r>
+      <w:r>
+        <w:rPr>
+          <w:rStyle w:val="SourceText"/>
+        </w:rPr>
+        <w:t>off</w:t>
+      </w:r>
+      <w:r>
+        <w:rPr/>
+        <w:t>, and autopilot's stops recommend finishing the in-flight ticket rather than telling you to run a script.</w:t>
       </w:r>
     </w:p>
     <w:sectPr>

</xml_diff>

<commit_message>
crew 1.0.76: T-0094 round-4 successor - docs, counts and version
CHANGELOG entry moved to 1.0.76 with the round-4 bullet and the sabotage count
(eight after the round-4 marker, by ast); README's could-not-tell list and
'since' notes, the daily-workflow guide source plus its rebuilt HTML/DOCX/PDF
(LibreOffice 26.2.5.2). origin/main is 1.0.75 (9af34e57).
</commit_message>
<xml_diff>
--- a/docs/guides/crew/crew-1.0-daily-workflow.docx
+++ b/docs/guides/crew/crew-1.0-daily-workflow.docx
@@ -2940,37 +2940,27 @@
       </w:pPr>
       <w:r>
         <w:rPr/>
-        <w:t xml:space="preserve">Nothing else is exempt, including </w:t>
-      </w:r>
-      <w:r>
-        <w:rPr>
-          <w:rStyle w:val="SourceText"/>
-        </w:rPr>
-        <w:t>.crew/</w:t>
-      </w:r>
-      <w:r>
-        <w:rPr/>
-        <w:t xml:space="preserve">, </w:t>
-      </w:r>
-      <w:r>
-        <w:rPr>
-          <w:rStyle w:val="SourceText"/>
-        </w:rPr>
-        <w:t>TODO.md</w:t>
-      </w:r>
-      <w:r>
-        <w:rPr/>
-        <w:t xml:space="preserve">, </w:t>
-      </w:r>
-      <w:r>
-        <w:rPr>
-          <w:rStyle w:val="SourceText"/>
-        </w:rPr>
-        <w:t>.claude/</w:t>
-      </w:r>
-      <w:r>
-        <w:rPr/>
-        <w:t xml:space="preserve"> and crew's own policy files. If the ticket changes one of them, list it in Touch. </w:t>
+        <w:t xml:space="preserve">The code map, the diagrams dir, the graph dir and </w:t>
+      </w:r>
+      <w:r>
+        <w:rPr>
+          <w:rStyle w:val="SourceText"/>
+        </w:rPr>
+        <w:t>.claude/rules/</w:t>
+      </w:r>
+      <w:r>
+        <w:rPr/>
+        <w:t xml:space="preserve"> are writable for an approved ticket, because </w:t>
+      </w:r>
+      <w:r>
+        <w:rPr>
+          <w:rStyle w:val="SourceText"/>
+        </w:rPr>
+        <w:t>/crew:implement</w:t>
+      </w:r>
+      <w:r>
+        <w:rPr/>
+        <w:t xml:space="preserve"> step 6 refreshes them. </w:t>
       </w:r>
     </w:p>
     <w:p>
@@ -2985,6 +2975,58 @@
           <w:tab w:val="left" w:pos="829" w:leader="none"/>
         </w:tabs>
         <w:bidi w:val="0"/>
+        <w:spacing w:before="120" w:after="0"/>
+        <w:ind w:hanging="283" w:left="829"/>
+        <w:jc w:val="left"/>
+        <w:rPr/>
+      </w:pPr>
+      <w:r>
+        <w:rPr/>
+        <w:t xml:space="preserve">Nothing else is exempt: </w:t>
+      </w:r>
+      <w:r>
+        <w:rPr>
+          <w:rStyle w:val="SourceText"/>
+        </w:rPr>
+        <w:t>.crew/</w:t>
+      </w:r>
+      <w:r>
+        <w:rPr/>
+        <w:t xml:space="preserve"> beyond the code map, </w:t>
+      </w:r>
+      <w:r>
+        <w:rPr>
+          <w:rStyle w:val="SourceText"/>
+        </w:rPr>
+        <w:t>TODO.md</w:t>
+      </w:r>
+      <w:r>
+        <w:rPr/>
+        <w:t xml:space="preserve">, the rest of </w:t>
+      </w:r>
+      <w:r>
+        <w:rPr>
+          <w:rStyle w:val="SourceText"/>
+        </w:rPr>
+        <w:t>.claude/</w:t>
+      </w:r>
+      <w:r>
+        <w:rPr/>
+        <w:t xml:space="preserve"> and crew's own policy files. If the ticket changes one of them, list it in Touch. </w:t>
+      </w:r>
+    </w:p>
+    <w:p>
+      <w:pPr>
+        <w:pStyle w:val="BodyText"/>
+        <w:numPr>
+          <w:ilvl w:val="0"/>
+          <w:numId w:val="6"/>
+        </w:numPr>
+        <w:tabs>
+          <w:tab w:val="clear" w:pos="1134"/>
+          <w:tab w:val="left" w:pos="829" w:leader="none"/>
+        </w:tabs>
+        <w:bidi w:val="0"/>
         <w:ind w:hanging="283" w:left="829"/>
         <w:jc w:val="left"/>
         <w:rPr/>
@@ -3124,7 +3166,69 @@
       </w:r>
       <w:r>
         <w:rPr/>
-        <w:t xml:space="preserve">, a shell redirect or a formatter can still change files. So when the session stops, the completion audit compares the whole tree with the commit the ticket started from. It covers committed, staged, unstaged and untracked changes, and both ends of a rename. If any changed path is outside Touch, the audit blocks the stop and lists the paths in six lines or fewer. It never blocks the continuation it caused. </w:t>
+        <w:t>, a shell redirect or a formatter can still change files. So when the session stops, the completion audit compares the whole tree with the commit the ticket started from. It covers committed, staged, unstaged and untracked changes, and both ends of a rename. If any changed path is outside Touch, the audit blocks the stop and lists the paths in six lines or fewer. It never blocks the continuation it caused.</w:t>
+      </w:r>
+    </w:p>
+    <w:p>
+      <w:pPr>
+        <w:pStyle w:val="BodyText"/>
+        <w:bidi w:val="0"/>
+        <w:jc w:val="left"/>
+        <w:rPr/>
+      </w:pPr>
+      <w:r>
+        <w:rPr/>
+        <w:t xml:space="preserve">A changed refresh artifact passes the audit only when a path the ticket changed reaches it and the edit is a re-anchor (the </w:t>
+      </w:r>
+      <w:r>
+        <w:rPr>
+          <w:rStyle w:val="SourceText"/>
+        </w:rPr>
+        <w:t>anchor:</w:t>
+      </w:r>
+      <w:r>
+        <w:rPr/>
+        <w:t xml:space="preserve"> or provenance sha moved forward to a commit on this branch) or a regeneration (</w:t>
+      </w:r>
+      <w:r>
+        <w:rPr>
+          <w:rStyle w:val="SourceText"/>
+        </w:rPr>
+        <w:t>.claude/rules/</w:t>
+      </w:r>
+      <w:r>
+        <w:rPr/>
+        <w:t xml:space="preserve"> as </w:t>
+      </w:r>
+      <w:r>
+        <w:rPr>
+          <w:rStyle w:val="SourceText"/>
+        </w:rPr>
+        <w:t>crew_instructions.py rules</w:t>
+      </w:r>
+      <w:r>
+        <w:rPr/>
+        <w:t xml:space="preserve"> writes them, the graph after a code change). A map claim edited without a re-anchor is listed with </w:t>
+      </w:r>
+      <w:r>
+        <w:rPr>
+          <w:rStyle w:val="SourceText"/>
+        </w:rPr>
+        <w:t>[anchor did not move]</w:t>
+      </w:r>
+      <w:r>
+        <w:rPr/>
+        <w:t xml:space="preserve">, and belongs in Touch if that is what the ticket means to do. When git cannot answer, a rule file cannot be read, a short base anchor is ambiguous (two commits share it), or the artifact dirs cannot be resolved, the listing says </w:t>
+      </w:r>
+      <w:r>
+        <w:rPr>
+          <w:rStyle w:val="SourceText"/>
+        </w:rPr>
+        <w:t>[could not tell: ...]</w:t>
+      </w:r>
+      <w:r>
+        <w:rPr/>
+        <w:t xml:space="preserve">, and that never passes. </w:t>
       </w:r>
       <w:r>
         <w:rPr>

</xml_diff>

<commit_message>
crew 1.0.76: merge-train docs - README, three guides rebuilt, CHANGELOG, TODO follow-ups, verify map rule (L-0520)
</commit_message>
<xml_diff>
--- a/docs/guides/crew/crew-1.0-daily-workflow.docx
+++ b/docs/guides/crew/crew-1.0-daily-workflow.docx
@@ -576,9 +576,61 @@
         <w:rPr/>
       </w:pPr>
       <w:r>
+        <w:rPr/>
+        <w:t xml:space="preserve">With parallel lanes in one clone, arm its </w:t>
+      </w:r>
+      <w:r>
         <w:rPr>
           <w:rStyle w:val="Strong"/>
         </w:rPr>
+        <w:t>merge train</w:t>
+      </w:r>
+      <w:r>
+        <w:rPr/>
+        <w:t xml:space="preserve"> once (</w:t>
+      </w:r>
+      <w:r>
+        <w:rPr>
+          <w:rStyle w:val="SourceText"/>
+        </w:rPr>
+        <w:t>crew_train.py arm</w:t>
+      </w:r>
+      <w:r>
+        <w:rPr/>
+        <w:t xml:space="preserve">, L-0520). Lanes still implement at the same time, overlapping Touch or not; only gate and land queue. The review round takes the train first: a ticket whose Touch overlaps one already holding it waits (the review exits 6, no round spent) and gates next, in the order the lanes reached their gate, while a ticket with a disjoint Touch gates at once. Catch up with </w:t>
+      </w:r>
+      <w:r>
+        <w:rPr>
+          <w:rStyle w:val="SourceText"/>
+        </w:rPr>
+        <w:t>crew_train.py catch-up --ticket T-0091</w:t>
+      </w:r>
+      <w:r>
+        <w:rPr/>
+        <w:t xml:space="preserve"> - a </w:t>
+      </w:r>
+      <w:r>
+        <w:rPr>
+          <w:rStyle w:val="SourceText"/>
+        </w:rPr>
+        <w:t>git merge</w:t>
+      </w:r>
+      <w:r>
+        <w:rPr/>
+        <w:t xml:space="preserve"> of the base, never a rebase, with git rerere on so a conflict resolved once replays next time (the replayed files are staged, listed, and shown to the reviewer).</w:t>
+      </w:r>
+    </w:p>
+    <w:p>
+      <w:pPr>
+        <w:pStyle w:val="BodyText"/>
+        <w:bidi w:val="0"/>
+        <w:jc w:val="left"/>
+        <w:rPr/>
+      </w:pPr>
+      <w:r>
+        <w:rPr>
+          <w:rStyle w:val="Strong"/>
+        </w:rPr>
         <w:t>8. Done.</w:t>
       </w:r>
       <w:r>
@@ -594,6 +646,58 @@
       <w:r>
         <w:rPr/>
         <w:t>. Three checks, all required: the review receipt rebuilds clean, the verify gate is clean, and the completion audit (the whole tree diffed against the scope base) finds nothing outside scope. Any one failing refuses the close and names what to fix. On success it appends a metrics row, marks the ticket done, and clears a stale handoff.</w:t>
+      </w:r>
+    </w:p>
+    <w:p>
+      <w:pPr>
+        <w:pStyle w:val="BodyText"/>
+        <w:bidi w:val="0"/>
+        <w:jc w:val="left"/>
+        <w:rPr/>
+      </w:pPr>
+      <w:r>
+        <w:rPr/>
+        <w:t xml:space="preserve">With the train armed, landing is part of done: </w:t>
+      </w:r>
+      <w:r>
+        <w:rPr>
+          <w:rStyle w:val="SourceText"/>
+        </w:rPr>
+        <w:t>crew_train.py check-land --ticket T-0091 --pr &lt;n&gt;</w:t>
+      </w:r>
+      <w:r>
+        <w:rPr/>
+        <w:t xml:space="preserve"> refuses unless T-0091 holds the train, </w:t>
+      </w:r>
+      <w:r>
+        <w:rPr>
+          <w:rStyle w:val="SourceText"/>
+        </w:rPr>
+        <w:t>git merge-tree</w:t>
+      </w:r>
+      <w:r>
+        <w:rPr/>
+        <w:t xml:space="preserve"> against the base is clean, the base has not moved in Touch paths, and HEAD carries the review receipt and a green gate; then it prints </w:t>
+      </w:r>
+      <w:r>
+        <w:rPr>
+          <w:rStyle w:val="SourceText"/>
+        </w:rPr>
+        <w:t>gh pr merge &lt;n&gt; --merge --match-head-commit &lt;sha&gt;</w:t>
+      </w:r>
+      <w:r>
+        <w:rPr/>
+        <w:t xml:space="preserve"> for you to run (crew never merges). After the merge, </w:t>
+      </w:r>
+      <w:r>
+        <w:rPr>
+          <w:rStyle w:val="SourceText"/>
+        </w:rPr>
+        <w:t>crew_train.py release --ticket T-0091 --merged &lt;merge sha&gt;</w:t>
+      </w:r>
+      <w:r>
+        <w:rPr/>
+        <w:t xml:space="preserve"> frees the train and tells every overlapping lane to merge the base now.</w:t>
       </w:r>
     </w:p>
     <w:p>

</xml_diff>

<commit_message>
L-0520 PR 1: docs, CHANGELOG, verify rule and crew_train.py docstring describe the advisory train (acquire before the gate round); review_run's exit 6 and the reviewer's rerere block are L-0526
</commit_message>
<xml_diff>
--- a/docs/guides/crew/crew-1.0-daily-workflow.docx
+++ b/docs/guides/crew/crew-1.0-daily-workflow.docx
@@ -597,7 +597,17 @@
       </w:r>
       <w:r>
         <w:rPr/>
-        <w:t xml:space="preserve">, L-0520). Lanes still implement at the same time, overlapping Touch or not; only gate and land queue. The review round takes the train first: a ticket whose Touch overlaps one already holding it waits (the review exits 6, no round spent) and gates next, in the order the lanes reached their gate, while a ticket with a disjoint Touch gates at once. Catch up with </w:t>
+        <w:t xml:space="preserve">, L-0520). Lanes still implement at the same time, overlapping Touch or not; only gate and land queue. Before the review round, </w:t>
+      </w:r>
+      <w:r>
+        <w:rPr>
+          <w:rStyle w:val="SourceText"/>
+        </w:rPr>
+        <w:t>crew_train.py acquire --ticket T-0091</w:t>
+      </w:r>
+      <w:r>
+        <w:rPr/>
+        <w:t xml:space="preserve"> takes the train: a ticket whose Touch overlaps one already holding it waits (exit 1, colliding paths named) and gates next, in the order the lanes reached their gate, while a ticket with a disjoint Touch gates at once. Catch up with </w:t>
       </w:r>
       <w:r>
         <w:rPr>
@@ -617,7 +627,7 @@
       </w:r>
       <w:r>
         <w:rPr/>
-        <w:t xml:space="preserve"> of the base, never a rebase, with git rerere on so a conflict resolved once replays next time (the replayed files are staged, listed, and shown to the reviewer).</w:t>
+        <w:t xml:space="preserve"> of the base, never a rebase, with git rerere on so a conflict resolved once replays next time (the replayed files are staged and listed; show them to the reviewer).</w:t>
       </w:r>
     </w:p>
     <w:p>

</xml_diff>

<commit_message>
T-0094 r6: daily-workflow guide rebuilt (LibreOffice 26.2.5.2, NOT Microsoft Word)
</commit_message>
<xml_diff>
--- a/docs/guides/crew/crew-1.0-daily-workflow.docx
+++ b/docs/guides/crew/crew-1.0-daily-workflow.docx
@@ -3208,7 +3208,7 @@
       </w:r>
       <w:r>
         <w:rPr/>
-        <w:t xml:space="preserve"> writes them, the graph after a code change). A map claim edited without a re-anchor is listed with </w:t>
+        <w:t xml:space="preserve"> writes them, the graph after a code change). A deleted rendered diagram or graph file, a symlink at or along an artifact's path, or a file whose git mode changed never passes. A map claim edited without a re-anchor is listed with </w:t>
       </w:r>
       <w:r>
         <w:rPr>
@@ -3218,7 +3218,7 @@
       </w:r>
       <w:r>
         <w:rPr/>
-        <w:t xml:space="preserve">, and belongs in Touch if that is what the ticket means to do. When git cannot answer, a rule file cannot be read, a short base anchor is ambiguous (two commits share it), the artifact dirs cannot be resolved, or a directory the hook cannot search hides whether the config, a rule or a map exists, the listing says </w:t>
+        <w:t xml:space="preserve">, and belongs in Touch if that is what the ticket means to do. When git cannot answer, a rule file cannot be read, a short base anchor is ambiguous (two commits share it), the artifact dirs cannot be resolved, or a directory the hook cannot search hides whether the config, a rule or a map exists, or two configured artifact dirs are equally specific for a path, the listing says </w:t>
       </w:r>
       <w:r>
         <w:rPr>
@@ -3228,7 +3228,17 @@
       </w:r>
       <w:r>
         <w:rPr/>
-        <w:t xml:space="preserve">, and that never passes. </w:t>
+        <w:t xml:space="preserve">, and that never passes. (These verdicts are </w:t>
+      </w:r>
+      <w:r>
+        <w:rPr>
+          <w:rStyle w:val="SourceText"/>
+        </w:rPr>
+        <w:t>crew_refresh_check.py</w:t>
+      </w:r>
+      <w:r>
+        <w:rPr/>
+        <w:t xml:space="preserve">'s; the audit applies them once L-0540 lands, and until then admits the artifact dirs for an approved ticket.) </w:t>
       </w:r>
       <w:r>
         <w:rPr>

</xml_diff>

<commit_message>
L-0558: crew 1.0.87 - docs for the train fixes and the rerere rule
README merge-train section, daily-workflow and troubleshooting guides (sources
and rebuilt HTML/DOCX/PDF), CHANGELOG, verify.json rule 37's why and timing,
the code map's merge-train section. BUDGETS.md unchanged: plugin/crew/*.md
still totals 21,544 lines across 137 files.
</commit_message>
<xml_diff>
--- a/docs/guides/crew/crew-1.0-daily-workflow.docx
+++ b/docs/guides/crew/crew-1.0-daily-workflow.docx
@@ -627,7 +627,67 @@
       </w:r>
       <w:r>
         <w:rPr/>
-        <w:t xml:space="preserve"> of the base, never a rebase, with git rerere on so a conflict resolved once replays next time (the replayed files are staged and listed; show them to the reviewer).</w:t>
+        <w:t xml:space="preserve"> of the base, never a rebase, with git rerere on so a conflict resolved once replays next time. A replay is left unstaged and listed: inspect it, </w:t>
+      </w:r>
+      <w:r>
+        <w:rPr>
+          <w:rStyle w:val="SourceText"/>
+        </w:rPr>
+        <w:t>git add</w:t>
+      </w:r>
+      <w:r>
+        <w:rPr/>
+        <w:t xml:space="preserve"> it, and show it to the reviewer. crew never turns on </w:t>
+      </w:r>
+      <w:r>
+        <w:rPr>
+          <w:rStyle w:val="SourceText"/>
+        </w:rPr>
+        <w:t>rerere.autoupdate</w:t>
+      </w:r>
+      <w:r>
+        <w:rPr/>
+        <w:t>, and the version files (</w:t>
+      </w:r>
+      <w:r>
+        <w:rPr>
+          <w:rStyle w:val="SourceText"/>
+        </w:rPr>
+        <w:t>plugin.json</w:t>
+      </w:r>
+      <w:r>
+        <w:rPr/>
+        <w:t xml:space="preserve">, </w:t>
+      </w:r>
+      <w:r>
+        <w:rPr>
+          <w:rStyle w:val="SourceText"/>
+        </w:rPr>
+        <w:t>marketplace.json</w:t>
+      </w:r>
+      <w:r>
+        <w:rPr/>
+        <w:t xml:space="preserve">, </w:t>
+      </w:r>
+      <w:r>
+        <w:rPr>
+          <w:rStyle w:val="SourceText"/>
+        </w:rPr>
+        <w:t>PLUGINS.md</w:t>
+      </w:r>
+      <w:r>
+        <w:rPr/>
+        <w:t xml:space="preserve">, </w:t>
+      </w:r>
+      <w:r>
+        <w:rPr>
+          <w:rStyle w:val="SourceText"/>
+        </w:rPr>
+        <w:t>CHANGELOG.md</w:t>
+      </w:r>
+      <w:r>
+        <w:rPr/>
+        <w:t>) are never replayed - they come back conflicted, named as forgotten, for you to resolve by hand.</w:t>
       </w:r>
     </w:p>
     <w:p>

</xml_diff>

<commit_message>
T-0504: rebuild the daily-workflow and troubleshooting guides on the merged tree (build.py, LibreOffice 26.2.5.2 on Linux)
</commit_message>
<xml_diff>
--- a/docs/guides/crew/crew-1.0-daily-workflow.docx
+++ b/docs/guides/crew/crew-1.0-daily-workflow.docx
@@ -4049,19 +4049,141 @@
       <w:pPr>
         <w:pStyle w:val="BodyText"/>
         <w:bidi w:val="0"/>
+        <w:jc w:val="left"/>
+        <w:rPr/>
+      </w:pPr>
+      <w:r>
+        <w:rPr>
+          <w:rStyle w:val="SourceText"/>
+        </w:rPr>
+        <w:t>crew_ticket.py activate --ticket &lt;id&gt;</w:t>
+      </w:r>
+      <w:r>
+        <w:rPr/>
+        <w:t xml:space="preserve"> sets the active ticket for the current worktree. </w:t>
+      </w:r>
+      <w:r>
+        <w:rPr>
+          <w:rStyle w:val="SourceText"/>
+        </w:rPr>
+        <w:t>deactivate</w:t>
+      </w:r>
+      <w:r>
+        <w:rPr/>
+        <w:t xml:space="preserve"> clears it, and </w:t>
+      </w:r>
+      <w:r>
+        <w:rPr>
+          <w:rStyle w:val="SourceText"/>
+        </w:rPr>
+        <w:t>active</w:t>
+      </w:r>
+      <w:r>
+        <w:rPr/>
+        <w:t xml:space="preserve"> prints it. Without a setting, crew uses the open ticket in </w:t>
+      </w:r>
+      <w:r>
+        <w:rPr>
+          <w:rStyle w:val="SourceText"/>
+        </w:rPr>
+        <w:t>.work/INDEX.md</w:t>
+      </w:r>
+      <w:r>
+        <w:rPr/>
+        <w:t xml:space="preserve"> if </w:t>
+      </w:r>
+      <w:r>
+        <w:rPr>
+          <w:rStyle w:val="SourceText"/>
+        </w:rPr>
+        <w:t>.work/tickets/&lt;id&gt;/</w:t>
+      </w:r>
+      <w:r>
+        <w:rPr/>
+        <w:t xml:space="preserve"> exists. With no active ticket, the edit guard only protects approval and ledger state, and the completion audit does nothing.</w:t>
+      </w:r>
+    </w:p>
+    <w:p>
+      <w:pPr>
+        <w:pStyle w:val="BodyText"/>
+        <w:bidi w:val="0"/>
         <w:spacing w:before="120" w:after="120"/>
         <w:jc w:val="left"/>
         <w:rPr/>
       </w:pPr>
       <w:r>
-        <w:rPr>
-          <w:rStyle w:val="SourceText"/>
-        </w:rPr>
-        <w:t>crew_ticket.py activate --ticket &lt;id&gt;</w:t>
-      </w:r>
-      <w:r>
-        <w:rPr/>
-        <w:t xml:space="preserve"> sets the active ticket for the current worktree. </w:t>
+        <w:rPr/>
+        <w:t xml:space="preserve">Who moves it depends on whether the move can widen scope. </w:t>
+      </w:r>
+      <w:r>
+        <w:rPr>
+          <w:rStyle w:val="SourceText"/>
+        </w:rPr>
+        <w:t>/crew:autopilot</w:t>
+      </w:r>
+      <w:r>
+        <w:rPr/>
+        <w:t xml:space="preserve"> sets it itself when the worktree has no active ticket, when it already names the ticket, or when it names a ticket closed by an accepted review (a </w:t>
+      </w:r>
+      <w:r>
+        <w:rPr>
+          <w:rStyle w:val="SourceText"/>
+        </w:rPr>
+        <w:t>clean</w:t>
+      </w:r>
+      <w:r>
+        <w:rPr/>
+        <w:t xml:space="preserve"> or </w:t>
+      </w:r>
+      <w:r>
+        <w:rPr>
+          <w:rStyle w:val="SourceText"/>
+        </w:rPr>
+        <w:t>owner-accepted</w:t>
+      </w:r>
+      <w:r>
+        <w:rPr/>
+        <w:t xml:space="preserve"> receipt in the review ledger, plus </w:t>
+      </w:r>
+      <w:r>
+        <w:rPr>
+          <w:rStyle w:val="SourceText"/>
+        </w:rPr>
+        <w:t>done</w:t>
+      </w:r>
+      <w:r>
+        <w:rPr/>
+        <w:t xml:space="preserve"> in </w:t>
+      </w:r>
+      <w:r>
+        <w:rPr>
+          <w:rStyle w:val="SourceText"/>
+        </w:rPr>
+        <w:t>.work/INDEX.md</w:t>
+      </w:r>
+      <w:r>
+        <w:rPr/>
+        <w:t xml:space="preserve"> or the spec header). Moving off a ticket that is still in flight is yours: type </w:t>
+      </w:r>
+      <w:r>
+        <w:rPr>
+          <w:rStyle w:val="SourceText"/>
+        </w:rPr>
+        <w:t>/crew:autopilot &lt;id&gt;</w:t>
+      </w:r>
+      <w:r>
+        <w:rPr/>
+        <w:t xml:space="preserve">, and crew's prompt hook re-points this worktree and says which ticket it left. The edit guard refuses the session's own </w:t>
+      </w:r>
+      <w:r>
+        <w:rPr>
+          <w:rStyle w:val="SourceText"/>
+        </w:rPr>
+        <w:t>activate</w:t>
+      </w:r>
+      <w:r>
+        <w:rPr/>
+        <w:t xml:space="preserve"> or </w:t>
       </w:r>
       <w:r>
         <w:rPr>
@@ -4071,37 +4193,17 @@
       </w:r>
       <w:r>
         <w:rPr/>
-        <w:t xml:space="preserve"> clears it, and </w:t>
-      </w:r>
-      <w:r>
-        <w:rPr>
-          <w:rStyle w:val="SourceText"/>
-        </w:rPr>
-        <w:t>active</w:t>
-      </w:r>
-      <w:r>
-        <w:rPr/>
-        <w:t xml:space="preserve"> prints it. Without a setting, crew uses the open ticket in </w:t>
-      </w:r>
-      <w:r>
-        <w:rPr>
-          <w:rStyle w:val="SourceText"/>
-        </w:rPr>
-        <w:t>.work/INDEX.md</w:t>
-      </w:r>
-      <w:r>
-        <w:rPr/>
-        <w:t xml:space="preserve"> if </w:t>
-      </w:r>
-      <w:r>
-        <w:rPr>
-          <w:rStyle w:val="SourceText"/>
-        </w:rPr>
-        <w:t>.work/tickets/&lt;id&gt;/</w:t>
-      </w:r>
-      <w:r>
-        <w:rPr/>
-        <w:t xml:space="preserve"> exists. With no active ticket, the edit guard only protects approval and ledger state, and the completion audit does nothing.</w:t>
+        <w:t xml:space="preserve"> for that move under every mode but </w:t>
+      </w:r>
+      <w:r>
+        <w:rPr>
+          <w:rStyle w:val="SourceText"/>
+        </w:rPr>
+        <w:t>off</w:t>
+      </w:r>
+      <w:r>
+        <w:rPr/>
+        <w:t>, and autopilot's stops recommend finishing the in-flight ticket rather than telling you to run a script.</w:t>
       </w:r>
     </w:p>
     <w:sectPr>

</xml_diff>

<commit_message>
L-0575: re-anchor eight code maps, INDEX and the lifecycle diagram to dac06883; rebuild the daily-workflow guide; rules regenerated
implement.md step 2 prints the recurring-findings checklist (diagram im2), its
method paragraph lost a line (im0/im1 citations -1, difflib); verify.json's new
last rule is in verification-harness's body. Provenance citations kept.
</commit_message>
<xml_diff>
--- a/docs/guides/crew/crew-1.0-daily-workflow.docx
+++ b/docs/guides/crew/crew-1.0-daily-workflow.docx
@@ -411,7 +411,17 @@
       </w:r>
       <w:r>
         <w:rPr/>
-        <w:t xml:space="preserve"> blocks any write outside the spec's Touch globs before it happens, not after.</w:t>
+        <w:t xml:space="preserve"> blocks any write outside the spec's Touch globs before it happens, not after. Before the first step it prints the recurring-findings checklist (</w:t>
+      </w:r>
+      <w:r>
+        <w:rPr>
+          <w:rStyle w:val="SourceText"/>
+        </w:rPr>
+        <w:t>recurring_findings.py --ticket T-0091</w:t>
+      </w:r>
+      <w:r>
+        <w:rPr/>
+        <w:t>): the defect classes earlier reviews kept finding on paths like the spec's Touch list, a few probes each, kept open while the plan is worked and handed to whichever developer types.</w:t>
       </w:r>
     </w:p>
     <w:p>

</xml_diff>

<commit_message>
L-0522: rebuild the daily-workflow guide (HTML, DOCX, PDF) for the landing order
Claude-Session: https://claude.ai/code/session_01XqPLTy3rVKZ7QKRsp5snXv
</commit_message>
<xml_diff>
--- a/docs/guides/crew/crew-1.0-daily-workflow.docx
+++ b/docs/guides/crew/crew-1.0-daily-workflow.docx
@@ -767,7 +767,47 @@
       </w:r>
       <w:r>
         <w:rPr/>
-        <w:t xml:space="preserve"> for you to run (crew never merges). After the merge, </w:t>
+        <w:t xml:space="preserve"> for you to run (crew never merges). When it refuses, land in this order: </w:t>
+      </w:r>
+      <w:r>
+        <w:rPr>
+          <w:rStyle w:val="SourceText"/>
+        </w:rPr>
+        <w:t>crew_train.py catch-up</w:t>
+      </w:r>
+      <w:r>
+        <w:rPr/>
+        <w:t xml:space="preserve"> (resolve any conflict), bump the version one past the base's, refresh the artifacts, commit, gate the merged head, then </w:t>
+      </w:r>
+      <w:r>
+        <w:rPr>
+          <w:rStyle w:val="SourceText"/>
+        </w:rPr>
+        <w:t>check-land</w:t>
+      </w:r>
+      <w:r>
+        <w:rPr/>
+        <w:t xml:space="preserve"> again, so the tree the gate passed is the tree that lands. After the review, a re-anchor changes only the </w:t>
+      </w:r>
+      <w:r>
+        <w:rPr>
+          <w:rStyle w:val="SourceText"/>
+        </w:rPr>
+        <w:t>anchor:</w:t>
+      </w:r>
+      <w:r>
+        <w:rPr/>
+        <w:t xml:space="preserve"> sha and regenerates the rules; its provenance goes in the ticket's </w:t>
+      </w:r>
+      <w:r>
+        <w:rPr>
+          <w:rStyle w:val="SourceText"/>
+        </w:rPr>
+        <w:t>notes.md</w:t>
+      </w:r>
+      <w:r>
+        <w:rPr/>
+        <w:t xml:space="preserve">. After the merge, </w:t>
       </w:r>
       <w:r>
         <w:rPr>

</xml_diff>

<commit_message>
L-0522: rebuild the daily-workflow guide after review round 1
Claude-Session: https://claude.ai/code/session_01XqPLTy3rVKZ7QKRsp5snXv
</commit_message>
<xml_diff>
--- a/docs/guides/crew/crew-1.0-daily-workflow.docx
+++ b/docs/guides/crew/crew-1.0-daily-workflow.docx
@@ -777,7 +777,17 @@
       </w:r>
       <w:r>
         <w:rPr/>
-        <w:t xml:space="preserve"> (resolve any conflict), bump the version one past the base's, refresh the artifacts, commit, gate the merged head, then </w:t>
+        <w:t xml:space="preserve"> (resolve any conflict), bump the version one past the base's, refresh the artifacts, commit, gate the merged head, review it again if </w:t>
+      </w:r>
+      <w:r>
+        <w:rPr>
+          <w:rStyle w:val="SourceText"/>
+        </w:rPr>
+        <w:t>review_ledger.py --check-receipt</w:t>
+      </w:r>
+      <w:r>
+        <w:rPr/>
+        <w:t xml:space="preserve"> reads stale, then </w:t>
       </w:r>
       <w:r>
         <w:rPr>

</xml_diff>

<commit_message>
T-0100: WIP handoff to cloud session - uncommitted work as found, unverified
Claude-Session: https://claude.ai/code/session_01TqWyfY29d3MBuodVqvKtTY
</commit_message>
<xml_diff>
--- a/docs/guides/crew/crew-1.0-daily-workflow.docx
+++ b/docs/guides/crew/crew-1.0-daily-workflow.docx
@@ -593,7 +593,7 @@
       </w:r>
       <w:r>
         <w:rPr/>
-        <w:t>. Three checks, all required: the review receipt rebuilds clean, the verify gate is clean, and the completion audit (the whole tree diffed against the scope base) finds nothing outside scope. Any one failing refuses the close and names what to fix. On success it appends a metrics row, marks the ticket done, and clears a stale handoff.</w:t>
+        <w:t>. Three checks, all required: the review receipt rebuilds clean, the verify gate is clean, and the completion audit (the whole tree diffed against the scope base, not counting a file that is byte-identical to main as last merged) finds nothing outside scope. Any one failing refuses the close and names what to fix. On success it appends a metrics row, marks the ticket done, and clears a stale handoff.</w:t>
       </w:r>
     </w:p>
     <w:p>
@@ -3124,7 +3124,7 @@
       </w:r>
       <w:r>
         <w:rPr/>
-        <w:t xml:space="preserve">, a shell redirect or a formatter can still change files. So when the session stops, the completion audit compares the whole tree with the commit the ticket started from. It covers committed, staged, unstaged and untracked changes, and both ends of a rename. If any changed path is outside Touch, the audit blocks the stop and lists the paths in six lines or fewer. It never blocks the continuation it caused. </w:t>
+        <w:t xml:space="preserve">, a shell redirect or a formatter can still change files. So when the session stops, the completion audit compares the whole tree with the commit the ticket started from. It covers committed, staged, unstaged and untracked changes, and both ends of a rename. After you merge main, a file byte-identical to the merged main commit is not counted: it is main's change, not the ticket's; the verdict names that commit. If any changed path is outside Touch, the audit blocks the stop and lists the paths in six lines or fewer. It never blocks the continuation it caused. </w:t>
       </w:r>
       <w:r>
         <w:rPr>

</xml_diff>

<commit_message>
T-0100 refresh after the merges of main 34d9f267 and T-0061-harness 0ea84c6e: T-0100's DERIVED map lines re-applied, rules regenerated, guides rebuilt, BUDGETS re-measured
crew.md regains T-0100's DERIVED bullet with every citation re-measured on
this tree (merged_main.py, review_patch.py, completion_audit.py,
review_prompt.py, review_ledger.py) and the base_branch / HARNESS facts;
verification-harness.md's rule 25 sentence names T-0100's three files.
Daily-workflow and troubleshooting guides rebuilt from the merged sources
(LibreOffice 24.2.7.2, not Word). BUDGETS.md: 22,056 lines across 138
files (owner standing rule). Map anchors are not moved here.

Claude-Session: https://claude.ai/code/session_01TVtpgC8Ad23DQsSGD1ngVF
</commit_message>
<xml_diff>
--- a/docs/guides/crew/crew-1.0-daily-workflow.docx
+++ b/docs/guides/crew/crew-1.0-daily-workflow.docx
@@ -756,7 +756,7 @@
       </w:r>
       <w:r>
         <w:rPr/>
-        <w:t>. Three checks, all required: the review receipt rebuilds clean, the verify gate is clean, and the completion audit (the whole tree diffed against the scope base) finds nothing outside scope. Any one failing refuses the close and names what to fix. On success it appends a metrics row, marks the ticket done, and clears a stale handoff.</w:t>
+        <w:t>. Three checks, all required: the review receipt rebuilds clean, the verify gate is clean, and the completion audit (the whole tree diffed against the scope base, not counting a file that is byte-identical to main as last merged) finds nothing outside scope. Any one failing refuses the close and names what to fix. On success it appends a metrics row, marks the ticket done, and clears a stale handoff.</w:t>
       </w:r>
     </w:p>
     <w:p>
@@ -3381,7 +3381,7 @@
       </w:r>
       <w:r>
         <w:rPr/>
-        <w:t>, a shell redirect or a formatter can still change files. So when the session stops, the completion audit compares the whole tree with the commit the ticket started from. It covers committed, staged, unstaged and untracked changes, and both ends of a rename. If any changed path is outside Touch, the audit blocks the stop and lists the paths in six lines or fewer. It never blocks the continuation it caused.</w:t>
+        <w:t>, a shell redirect or a formatter can still change files. So when the session stops, the completion audit compares the whole tree with the commit the ticket started from. It covers committed, staged, unstaged and untracked changes, and both ends of a rename. After you merge main, a file byte-identical to the merged main commit is not counted: it is main's change, not the ticket's; the verdict names that commit. If any changed path is outside Touch, the audit blocks the stop and lists the paths in six lines or fewer. It never blocks the continuation it caused.</w:t>
       </w:r>
     </w:p>
     <w:p>

</xml_diff>

<commit_message>
T-0039: crew keeps .gitignore right for the languages in the repo
crew_gitignore.py (check/apply/summary) detects languages from git-listed
files, recommends patterns from a table vendored from github/gitignore, and
adds what is missing inside one managed block at the top of the root
.gitignore - atomically, never touching a human line or the .crew policy
block, never untracking. Wired into /crew:init Phase 1, /crew:onboard (and
--refresh), /crew:implement step 6 (check) and a /crew:status line.

Claude-Session: https://claude.ai/code/session_016wQA2o38aSB65bpjaGpMVJ
</commit_message>
<xml_diff>
--- a/docs/guides/crew/crew-1.0-daily-workflow.docx
+++ b/docs/guides/crew/crew-1.0-daily-workflow.docx
@@ -480,7 +480,37 @@
       </w:r>
       <w:r>
         <w:rPr/>
-        <w:t xml:space="preserve"> runs next and usually says "none" — most tickets touch no document that needs updating.</w:t>
+        <w:t xml:space="preserve"> runs next and usually says "none" — most tickets touch no document that needs updating. Then </w:t>
+      </w:r>
+      <w:r>
+        <w:rPr>
+          <w:rStyle w:val="SourceText"/>
+        </w:rPr>
+        <w:t>crew_gitignore.py check</w:t>
+      </w:r>
+      <w:r>
+        <w:rPr/>
+        <w:t xml:space="preserve"> asks whether the ticket brought a language or manifest whose ignore patterns are missing: it adds them only if the spec's Touch covers </w:t>
+      </w:r>
+      <w:r>
+        <w:rPr>
+          <w:rStyle w:val="SourceText"/>
+        </w:rPr>
+        <w:t>.gitignore</w:t>
+      </w:r>
+      <w:r>
+        <w:rPr/>
+        <w:t xml:space="preserve">, and otherwise the PR body lists them and the next </w:t>
+      </w:r>
+      <w:r>
+        <w:rPr>
+          <w:rStyle w:val="SourceText"/>
+        </w:rPr>
+        <w:t>/crew:onboard</w:t>
+      </w:r>
+      <w:r>
+        <w:rPr/>
+        <w:t xml:space="preserve"> adds them.</w:t>
       </w:r>
     </w:p>
     <w:p>

</xml_diff>

<commit_message>
L-0509: prompts, docs and verify map for the Complete archive
brainstorm/fix take the next number above every INDEX id with this box's
prefix; no command hard-codes T-####. README, trackers.md, obsidian-sync,
status.md and the two guides (rebuilt) describe Complete/, the resolver's
could-not-tell and the archive verb. CHANGELOG entry; verify.json gains a
rule for crew_common/status/migrate/metrics/webtest_guard and re-times the
tracker rule.

Claude-Session: https://claude.ai/code/session_016wQA2o38aSB65bpjaGpMVJ
</commit_message>
<xml_diff>
--- a/docs/guides/crew/crew-1.0-daily-workflow.docx
+++ b/docs/guides/crew/crew-1.0-daily-workflow.docx
@@ -2460,7 +2460,67 @@
       </w:r>
       <w:r>
         <w:rPr/>
-        <w:t>:</w:t>
+        <w:t xml:space="preserve"> (once done and archived with </w:t>
+      </w:r>
+      <w:r>
+        <w:rPr>
+          <w:rStyle w:val="SourceText"/>
+        </w:rPr>
+        <w:t>crew_tracker.py archive</w:t>
+      </w:r>
+      <w:r>
+        <w:rPr/>
+        <w:t xml:space="preserve">, in </w:t>
+      </w:r>
+      <w:r>
+        <w:rPr>
+          <w:rStyle w:val="SourceText"/>
+        </w:rPr>
+        <w:t>.work/tickets/Complete/&lt;id&gt;/</w:t>
+      </w:r>
+      <w:r>
+        <w:rPr/>
+        <w:t xml:space="preserve">; crew finds it in either place, and a ticket present in both is "could not tell", which refuses). An id is </w:t>
+      </w:r>
+      <w:r>
+        <w:rPr>
+          <w:rStyle w:val="SourceText"/>
+        </w:rPr>
+        <w:t>LETTERS-digits</w:t>
+      </w:r>
+      <w:r>
+        <w:rPr/>
+        <w:t xml:space="preserve"> with any prefix (</w:t>
+      </w:r>
+      <w:r>
+        <w:rPr>
+          <w:rStyle w:val="SourceText"/>
+        </w:rPr>
+        <w:t>T-</w:t>
+      </w:r>
+      <w:r>
+        <w:rPr/>
+        <w:t xml:space="preserve">, </w:t>
+      </w:r>
+      <w:r>
+        <w:rPr>
+          <w:rStyle w:val="SourceText"/>
+        </w:rPr>
+        <w:t>L-</w:t>
+      </w:r>
+      <w:r>
+        <w:rPr/>
+        <w:t xml:space="preserve">, </w:t>
+      </w:r>
+      <w:r>
+        <w:rPr>
+          <w:rStyle w:val="SourceText"/>
+        </w:rPr>
+        <w:t>W-</w:t>
+      </w:r>
+      <w:r>
+        <w:rPr/>
+        <w:t>):</w:t>
       </w:r>
     </w:p>
     <w:p>

</xml_diff>

<commit_message>
T-0060: blocker pings - approval waiting, review out of rounds, lane stalled, Stop gate refused
crew_notify.py gives blocker a sender: run-stop decides which /crew:autopilot
stop pings (approve, in-flight via T-0049's holds(), accept-review/replan via
rounds_check), and stop counts Stop gate refusals per gate, session and
ticket. The Stop gates' and the review ledger's calls are harness-only
follow-ups (T-0087 rule).

Claude-Session: https://claude.ai/code/session_016wQA2o38aSB65bpjaGpMVJ
</commit_message>
<xml_diff>
--- a/docs/guides/crew/crew-1.0-daily-workflow.docx
+++ b/docs/guides/crew/crew-1.0-daily-workflow.docx
@@ -3688,7 +3688,37 @@
       </w:r>
       <w:r>
         <w:rPr/>
-        <w:t xml:space="preserve">. Write a different plan and approve it. </w:t>
+        <w:t xml:space="preserve">. With notify on, the last round carrying a BLOCK sends the </w:t>
+      </w:r>
+      <w:r>
+        <w:rPr>
+          <w:rStyle w:val="SourceText"/>
+        </w:rPr>
+        <w:t>Review out of rounds</w:t>
+      </w:r>
+      <w:r>
+        <w:rPr/>
+        <w:t xml:space="preserve"> ping (</w:t>
+      </w:r>
+      <w:r>
+        <w:rPr>
+          <w:rStyle w:val="SourceText"/>
+        </w:rPr>
+        <w:t>-&gt; /crew:plan &lt;id&gt;</w:t>
+      </w:r>
+      <w:r>
+        <w:rPr/>
+        <w:t xml:space="preserve">) when </w:t>
+      </w:r>
+      <w:r>
+        <w:rPr>
+          <w:rStyle w:val="SourceText"/>
+        </w:rPr>
+        <w:t>/crew:autopilot</w:t>
+      </w:r>
+      <w:r>
+        <w:rPr/>
+        <w:t xml:space="preserve"> stops on it. Write a different plan and approve it. </w:t>
       </w:r>
       <w:r>
         <w:rPr>

</xml_diff>

<commit_message>
L-0688: docs, codemap, guide and CHANGELOG; remove the ticket folder
README and the daily-workflow guide's refusal list name an artifact
removed from the index but left on disk; the guide is rebuilt (only its
three daily-workflow outputs committed). The code map's crew_refresh_check
citations move to HEAD and name the new refusal; rules regenerated.

Claude-Session: https://claude.ai/code/session_016wQA2o38aSB65bpjaGpMVJ
</commit_message>
<xml_diff>
--- a/docs/guides/crew/crew-1.0-daily-workflow.docx
+++ b/docs/guides/crew/crew-1.0-daily-workflow.docx
@@ -3423,7 +3423,17 @@
       </w:r>
       <w:r>
         <w:rPr/>
-        <w:t xml:space="preserve"> writes them, the graph after a code change). A deleted rendered diagram or graph file, a symlink at or along an artifact's path, or a file whose git mode changed never passes. A map claim edited without a re-anchor is listed with </w:t>
+        <w:t xml:space="preserve"> writes them, the graph after a code change). A deleted rendered diagram or graph file, a symlink at or along an artifact's path, a file whose git mode changed, or one removed from the index but left on disk (</w:t>
+      </w:r>
+      <w:r>
+        <w:rPr>
+          <w:rStyle w:val="SourceText"/>
+        </w:rPr>
+        <w:t>git rm --cached</w:t>
+      </w:r>
+      <w:r>
+        <w:rPr/>
+        <w:t xml:space="preserve">: the commit deletes it) never passes. A map claim edited without a re-anchor is listed with </w:t>
       </w:r>
       <w:r>
         <w:rPr>

</xml_diff>

<commit_message>
L-0652: docs, code map, verify rule, CHANGELOG; drop docs/tickets/L-0652
Claude-Session: https://claude.ai/code/session_016wQA2o38aSB65bpjaGpMVJ
</commit_message>
<xml_diff>
--- a/docs/guides/crew/crew-1.0-daily-workflow.docx
+++ b/docs/guides/crew/crew-1.0-daily-workflow.docx
@@ -3021,7 +3021,67 @@
       </w:r>
       <w:r>
         <w:rPr/>
-        <w:t>. The approval is a step you take, not a lock.</w:t>
+        <w:t xml:space="preserve">. </w:t>
+      </w:r>
+      <w:r>
+        <w:rPr>
+          <w:rStyle w:val="SourceText"/>
+        </w:rPr>
+        <w:t>/crew:autopilot sleep</w:t>
+      </w:r>
+      <w:r>
+        <w:rPr/>
+        <w:t xml:space="preserve"> starts that night mode now, until the window's end (12 hours with no window), and </w:t>
+      </w:r>
+      <w:r>
+        <w:rPr>
+          <w:rStyle w:val="SourceText"/>
+        </w:rPr>
+        <w:t>/crew:autopilot wake</w:t>
+      </w:r>
+      <w:r>
+        <w:rPr/>
+        <w:t xml:space="preserve"> ends it now (L-0652); they are autopilot's only other writers, and write only </w:t>
+      </w:r>
+      <w:r>
+        <w:rPr>
+          <w:rStyle w:val="SourceText"/>
+        </w:rPr>
+        <w:t>&lt;git-common-dir&gt;/crew/autopilot-sleep.json</w:t>
+      </w:r>
+      <w:r>
+        <w:rPr/>
+        <w:t xml:space="preserve">. </w:t>
+      </w:r>
+      <w:r>
+        <w:rPr>
+          <w:rStyle w:val="SourceText"/>
+        </w:rPr>
+        <w:t>sleep</w:t>
+      </w:r>
+      <w:r>
+        <w:rPr/>
+        <w:t xml:space="preserve"> needs </w:t>
+      </w:r>
+      <w:r>
+        <w:rPr>
+          <w:rStyle w:val="SourceText"/>
+        </w:rPr>
+        <w:t>scope.allowCliApproval: true</w:t>
+      </w:r>
+      <w:r>
+        <w:rPr/>
+        <w:t xml:space="preserve"> and a configured </w:t>
+      </w:r>
+      <w:r>
+        <w:rPr>
+          <w:rStyle w:val="SourceText"/>
+        </w:rPr>
+        <w:t>autopilot.sleep</w:t>
+      </w:r>
+      <w:r>
+        <w:rPr/>
+        <w:t xml:space="preserve"> override. The approval is a step you take, not a lock.</w:t>
       </w:r>
     </w:p>
     <w:p>

</xml_diff>

<commit_message>
L-0652: docs say manual sleep is tighten-only until L-1504; review NITs documented
README, CONFIG §20, autopilot.md (110 lines), PLUGINS.md, the daily-workflow
guide and CHANGELOG; code map paragraph re-derived; verify rule re-timed.

Claude-Session: https://claude.ai/code/session_016wQA2o38aSB65bpjaGpMVJ
</commit_message>
<xml_diff>
--- a/docs/guides/crew/crew-1.0-daily-workflow.docx
+++ b/docs/guides/crew/crew-1.0-daily-workflow.docx
@@ -3031,7 +3031,7 @@
       </w:r>
       <w:r>
         <w:rPr/>
-        <w:t xml:space="preserve"> starts that night mode now, until the window's end (12 hours with no window), and </w:t>
+        <w:t xml:space="preserve"> starts sleep mode now, until the window's end (12 hours with no window), and </w:t>
       </w:r>
       <w:r>
         <w:rPr>
@@ -3051,7 +3051,7 @@
       </w:r>
       <w:r>
         <w:rPr/>
-        <w:t xml:space="preserve">. </w:t>
+        <w:t xml:space="preserve">. Until L-1504 a manual sleep only tightens: outside the window it applies a night value only where it is stricter than the day value. </w:t>
       </w:r>
       <w:r>
         <w:rPr>
@@ -3071,17 +3071,7 @@
       </w:r>
       <w:r>
         <w:rPr/>
-        <w:t xml:space="preserve"> and a configured </w:t>
-      </w:r>
-      <w:r>
-        <w:rPr>
-          <w:rStyle w:val="SourceText"/>
-        </w:rPr>
-        <w:t>autopilot.sleep</w:t>
-      </w:r>
-      <w:r>
-        <w:rPr/>
-        <w:t xml:space="preserve"> override. The approval is a step you take, not a lock.</w:t>
+        <w:t xml:space="preserve"> and an override stricter than its day value. The approval is a step you take, not a lock.</w:t>
       </w:r>
     </w:p>
     <w:p>

</xml_diff>

<commit_message>
T-0074: daily-workflow guide states the auto-replan cap as the code enforces it (at most 5, every successor plan counts)
Claude-Session: https://claude.ai/code/session_016wQA2o38aSB65bpjaGpMVJ
</commit_message>
<xml_diff>
--- a/docs/guides/crew/crew-1.0-daily-workflow.docx
+++ b/docs/guides/crew/crew-1.0-daily-workflow.docx
@@ -2444,7 +2444,7 @@
             </w:pPr>
             <w:r>
               <w:rPr/>
-              <w:t>the ticket already has that many successor plans</w:t>
+              <w:t>the ticket already has that many successor plans on its review ledger, yours included</w:t>
             </w:r>
           </w:p>
         </w:tc>
@@ -2465,7 +2465,7 @@
             </w:pPr>
             <w:r>
               <w:rPr/>
-              <w:t>read the listed plans and decide: accept, fix, or redesign; raising the cap is your call</w:t>
+              <w:t>read the listed plans and decide: accept, fix, or redesign; raising the cap is your call, up to 5 (a larger value reads as 5, with a warning)</w:t>
             </w:r>
           </w:p>
         </w:tc>

</xml_diff>